<commit_message>
site: free SOP-001 page + downloads updated to v1.2.1
The free-SOP surface was missed in the v1.2.1 sweep: embedded body still
cited 'E6(R3) Section 4' (doesn't exist in R3 — repointed to GCP
Principles and Annex 1, matching the bundle source), page meta said
Version 1.2, and public/sops/ served the v1.2 Word/PDF. Downloads swapped
for the regenerated v1.2.1 files (cover verified via pypdf).

TASK-0714-008
</commit_message>
<xml_diff>
--- a/public/sops/SOP-001-Training-Qualification.docx
+++ b/public/sops/SOP-001-Training-Qualification.docx
@@ -38,7 +38,7 @@
           <w:color w:val="6B7280"/>
           <w:sz w:val="22"/>
         </w:rPr>
-        <w:t>Standard Operating Procedure  |  Template  |  Version 1.2</w:t>
+        <w:t>Standard Operating Procedure  |  Template  |  Version 1.2.1</w:t>
       </w:r>
     </w:p>
     <w:tbl>
@@ -271,7 +271,7 @@
                 <w:color w:val="6B7280"/>
                 <w:sz w:val="18"/>
               </w:rPr>
-              <w:t>1.2</w:t>
+              <w:t>1.2.1</w:t>
             </w:r>
           </w:p>
         </w:tc>
@@ -5241,7 +5241,7 @@
           <w:color w:val="1E1E2E"/>
           <w:sz w:val="20"/>
         </w:rPr>
-        <w:t>ICH E6(R3) Good Clinical Practice -- Section 4 (Quality Management System: stakeholder competency, CtQ factors, risk-proportionate quality management, documented training as QMS element)</w:t>
+        <w:t>ICH E6(R3) Good Clinical Practice -- GCP Principles and Annex 1, Quality Management (stakeholder competency, CtQ factors, risk-proportionate quality management, documented training as QMS element)</w:t>
       </w:r>
     </w:p>
     <w:p>

</xml_diff>

<commit_message>
site: free SOP-001 page + downloads updated to v1.2.1 (#36)
The free-SOP surface was missed in the v1.2.1 sweep: embedded body still
cited 'E6(R3) Section 4' (doesn't exist in R3 — repointed to GCP
Principles and Annex 1, matching the bundle source), page meta said
Version 1.2, and public/sops/ served the v1.2 Word/PDF. Downloads swapped
for the regenerated v1.2.1 files (cover verified via pypdf).

TASK-0714-008
</commit_message>
<xml_diff>
--- a/public/sops/SOP-001-Training-Qualification.docx
+++ b/public/sops/SOP-001-Training-Qualification.docx
@@ -38,7 +38,7 @@
           <w:color w:val="6B7280"/>
           <w:sz w:val="22"/>
         </w:rPr>
-        <w:t>Standard Operating Procedure  |  Template  |  Version 1.2</w:t>
+        <w:t>Standard Operating Procedure  |  Template  |  Version 1.2.1</w:t>
       </w:r>
     </w:p>
     <w:tbl>
@@ -271,7 +271,7 @@
                 <w:color w:val="6B7280"/>
                 <w:sz w:val="18"/>
               </w:rPr>
-              <w:t>1.2</w:t>
+              <w:t>1.2.1</w:t>
             </w:r>
           </w:p>
         </w:tc>
@@ -5241,7 +5241,7 @@
           <w:color w:val="1E1E2E"/>
           <w:sz w:val="20"/>
         </w:rPr>
-        <w:t>ICH E6(R3) Good Clinical Practice -- Section 4 (Quality Management System: stakeholder competency, CtQ factors, risk-proportionate quality management, documented training as QMS element)</w:t>
+        <w:t>ICH E6(R3) Good Clinical Practice -- GCP Principles and Annex 1, Quality Management (stakeholder competency, CtQ factors, risk-proportionate quality management, documented training as QMS element)</w:t>
       </w:r>
     </w:p>
     <w:p>

</xml_diff>